<commit_message>
Set the domain to getbattleplan.app and the app ID to app.getbattleplan
Records SPEC Q8 as decided and replaces battleplan.team and placeholder
domains in SPEC, ARCHITECTURE, TODO and the publishing guide.

Co-Authored-By: Claude Opus 5.5 (1M context) <noreply@anthropic.com>
Claude-Session: https://claude.ai/code/session_01Y5c9mWC7vHR6KP4VKNwzSB
</commit_message>
<xml_diff>
--- a/docs/Publishing-Battleplan-and-Yafie.docx
+++ b/docs/Publishing-Battleplan-and-Yafie.docx
@@ -237,7 +237,7 @@
         <w:rPr>
           <w:rFonts w:ascii="Arial" w:cs="Arial" w:eastAsia="Arial" w:hAnsi="Arial"/>
         </w:rPr>
-        <w:t xml:space="preserve">Buy </w:t>
+        <w:t xml:space="preserve"/>
       </w:r>
       <w:r>
         <w:rPr>
@@ -245,13 +245,13 @@
           <w:b/>
           <w:bCs/>
         </w:rPr>
-        <w:t xml:space="preserve">battleplan.team</w:t>
-      </w:r>
-      <w:r>
-        <w:rPr>
-          <w:rFonts w:ascii="Arial" w:cs="Arial" w:eastAsia="Arial" w:hAnsi="Arial"/>
-        </w:rPr>
-        <w:t xml:space="preserve"> at Cloudflare, signed in with your Gmail (unregistered as of Oct 9, 2026).</w:t>
+        <w:t xml:space="preserve">getbattleplan.app</w:t>
+      </w:r>
+      <w:r>
+        <w:rPr>
+          <w:rFonts w:ascii="Arial" w:cs="Arial" w:eastAsia="Arial" w:hAnsi="Arial"/>
+        </w:rPr>
+        <w:t xml:space="preserve"> is registered at Cloudflare under your Gmail (done October 2026).</w:t>
       </w:r>
     </w:p>
     <w:p>
@@ -371,7 +371,7 @@
         <w:rPr>
           <w:rFonts w:ascii="Arial" w:cs="Arial" w:eastAsia="Arial" w:hAnsi="Arial"/>
         </w:rPr>
-        <w:t xml:space="preserve">Connect battleplan.team to </w:t>
+        <w:t xml:space="preserve">Connect getbattleplan.app to </w:t>
       </w:r>
       <w:r>
         <w:rPr>
@@ -445,7 +445,7 @@
         <w:rPr>
           <w:rFonts w:ascii="Arial" w:cs="Arial" w:eastAsia="Arial" w:hAnsi="Arial"/>
         </w:rPr>
-        <w:t xml:space="preserve"> to send from noreply@battleplan.team, and add its SPF and DKIM records plus a DMARC record in Cloudflare.</w:t>
+        <w:t xml:space="preserve"> to send from noreply@getbattleplan.app, and add its SPF and DKIM records plus a DMARC record in Cloudflare.</w:t>
       </w:r>
     </w:p>
     <w:p>
@@ -469,7 +469,7 @@
           <w:b/>
           <w:bCs/>
         </w:rPr>
-        <w:t xml:space="preserve">from noreply@battleplan.team</w:t>
+        <w:t xml:space="preserve">from noreply@getbattleplan.app</w:t>
       </w:r>
       <w:r>
         <w:rPr>
@@ -696,7 +696,7 @@
         <w:rPr>
           <w:rFonts w:ascii="Arial" w:cs="Arial" w:eastAsia="Arial" w:hAnsi="Arial"/>
         </w:rPr>
-        <w:t xml:space="preserve">Register battleplan.team and noreply@ for </w:t>
+        <w:t xml:space="preserve">Register getbattleplan.app and noreply@ for </w:t>
       </w:r>
       <w:r>
         <w:rPr>
@@ -1026,7 +1026,7 @@
         <w:rPr>
           <w:rFonts w:ascii="Arial" w:cs="Arial" w:eastAsia="Arial" w:hAnsi="Arial"/>
         </w:rPr>
-        <w:t xml:space="preserve"> ($25 once) with your Gmail. Google verifies your legal name and address, and you confirm a physical Android phone (Android 10 or later) with the Play Console app. Google Play then shows your legal name, your country and a developer email; use support@battleplan.team for it, not your Gmail.</w:t>
+        <w:t xml:space="preserve"> ($25 once) with your Gmail. Google verifies your legal name and address, and you confirm a physical Android phone (Android 10 or later) with the Play Console app. Google Play then shows your legal name, your country and a developer email; use support@getbattleplan.app for it, not your Gmail.</w:t>
       </w:r>
     </w:p>
     <w:p>
@@ -2193,7 +2193,7 @@
                 <w:sz w:val="18"/>
                 <w:szCs w:val="18"/>
               </w:rPr>
-              <w:t xml:space="preserve">support@battleplan.team</w:t>
+              <w:t xml:space="preserve">support@getbattleplan.app</w:t>
             </w:r>
           </w:p>
         </w:tc>
@@ -2294,7 +2294,7 @@
                 <w:sz w:val="18"/>
                 <w:szCs w:val="18"/>
               </w:rPr>
-              <w:t xml:space="preserve">privacy@battleplan.team</w:t>
+              <w:t xml:space="preserve">privacy@getbattleplan.app</w:t>
             </w:r>
           </w:p>
         </w:tc>
@@ -2395,7 +2395,7 @@
                 <w:sz w:val="18"/>
                 <w:szCs w:val="18"/>
               </w:rPr>
-              <w:t xml:space="preserve">noreply@battleplan.team</w:t>
+              <w:t xml:space="preserve">noreply@getbattleplan.app</w:t>
             </w:r>
           </w:p>
         </w:tc>

</xml_diff>